<commit_message>
Fix Management Instructions formatting per request a11bc6a5
p.3's "In case of doubt, ..." paragraph closes out clause 4.3's bare-
numbered list (1.-7.) but was rendering flush at the margin instead of
indented to the list's own text column, because its last item ends in
terminal punctuation and so isn't itself treated as a short sub-heading —
the existing prev_subhead/nested_num_indent machinery only carried that
state forward for the lettered-Bullet-list case, not for a bare-numbered
Body-list's own un-numbered continuation paragraph. Generalizes the same
"this is the list's own closing text" indent to that case in both
generator.py and docx_generator.py.

Also drops a stray trailing full stop on p.4's item 5.1(f) — the only one
of that six-item lettered list with terminal punctuation.

Flips the request's pending.json entry to pending_review.

Co-Authored-By: Claude Sonnet 5 <noreply@anthropic.com>
Claude-Session: https://claude.ai/code/session_01VUsjveqB5rJTNZAuQyZqE6
</commit_message>
<xml_diff>
--- a/docs/files/Management_Instructions__Policy_2026-10.docx
+++ b/docs/files/Management_Instructions__Policy_2026-10.docx
@@ -19,7 +19,7 @@
               <a:graphicData uri="http://schemas.openxmlformats.org/drawingml/2006/picture">
                 <pic:pic>
                   <pic:nvPicPr>
-                    <pic:cNvPr id="0" name="tmp_ugk_2t1.png"/>
+                    <pic:cNvPr id="0" name="tmp5os65d7f.png"/>
                     <pic:cNvPicPr/>
                   </pic:nvPicPr>
                   <pic:blipFill>
@@ -732,6 +732,7 @@
     <w:p>
       <w:pPr>
         <w:spacing w:after="200"/>
+        <w:ind w:left="1416" w:firstLine="0"/>
         <w:jc w:val="both"/>
       </w:pPr>
       <w:r>
@@ -1138,7 +1139,7 @@
         </w:rPr>
         <w:t>(f)</w:t>
         <w:tab/>
-        <w:t>Any other events or circumstances that the Board of Directors should be informed of (e.g. material compliance matters).</w:t>
+        <w:t>Any other events or circumstances that the Board of Directors should be informed of (e.g. material compliance matters)</w:t>
       </w:r>
     </w:p>
     <w:p>

</xml_diff>